<commit_message>
add project report and update documentation
</commit_message>
<xml_diff>
--- a/Project/Documentation/Grp33_final_pd.docx
+++ b/Project/Documentation/Grp33_final_pd.docx
@@ -1496,7 +1496,31 @@
         <w:rPr>
           <w:lang w:val="en-GB"/>
         </w:rPr>
-        <w:t xml:space="preserve"> on integrating three major cloud storage providers: Google Drive, OneDrive, and SharePoint. Other cloud services </w:t>
+        <w:t xml:space="preserve"> on integrating </w:t>
+      </w:r>
+      <w:r>
+        <w:rPr>
+          <w:lang w:val="en-GB"/>
+        </w:rPr>
+        <w:t>two</w:t>
+      </w:r>
+      <w:r>
+        <w:rPr>
+          <w:lang w:val="en-GB"/>
+        </w:rPr>
+        <w:t xml:space="preserve"> major cloud storage providers: Google Drive</w:t>
+      </w:r>
+      <w:r>
+        <w:rPr>
+          <w:lang w:val="en-GB"/>
+        </w:rPr>
+        <w:t xml:space="preserve"> and</w:t>
+      </w:r>
+      <w:r>
+        <w:rPr>
+          <w:lang w:val="en-GB"/>
+        </w:rPr>
+        <w:t xml:space="preserve"> OneDrive. Other cloud services </w:t>
       </w:r>
       <w:r>
         <w:rPr>
@@ -1622,7 +1646,19 @@
         <w:rPr>
           <w:lang w:val="en-GB"/>
         </w:rPr>
-        <w:t>. Kamban guides the day-to-day work with a simple board (Backlog, Ready, In Progress, Verify, Done) and tasks will be completed one at the time. Tasks will only be split further if they exceed the usual pattern of implement, check, note. Ceremonies will be kept minimal: a quick daily board check and a brief end -of -week not on what is done and what is next.</w:t>
+        <w:t>. Kamban guides the day-to-day work with a simple board (Backlog, Ready, In Progress, Verify, Done) and tasks will be completed one at the time. Tasks will only be split further if they exceed the usual pattern of implement, check, note. Ceremonies will be kept minimal: a quick daily board check and a brief end-of-week not</w:t>
+      </w:r>
+      <w:r>
+        <w:rPr>
+          <w:lang w:val="en-GB"/>
+        </w:rPr>
+        <w:t>e</w:t>
+      </w:r>
+      <w:r>
+        <w:rPr>
+          <w:lang w:val="en-GB"/>
+        </w:rPr>
+        <w:t xml:space="preserve"> on what is done and what is next.</w:t>
       </w:r>
     </w:p>
     <w:p>
@@ -1701,7 +1737,19 @@
         <w:rPr>
           <w:lang w:val="en-GB"/>
         </w:rPr>
-        <w:t>Prepare integration setup for Google Drive, OneDrive and SharePoint APIs</w:t>
+        <w:t>Prepare integration setup for Google Drive</w:t>
+      </w:r>
+      <w:r>
+        <w:rPr>
+          <w:lang w:val="en-GB"/>
+        </w:rPr>
+        <w:t xml:space="preserve"> and</w:t>
+      </w:r>
+      <w:r>
+        <w:rPr>
+          <w:lang w:val="en-GB"/>
+        </w:rPr>
+        <w:t xml:space="preserve"> OneDrive APIs</w:t>
       </w:r>
       <w:r>
         <w:rPr>
@@ -1725,7 +1773,19 @@
         <w:rPr>
           <w:lang w:val="en-GB"/>
         </w:rPr>
-        <w:t>Week 3: Design UI mock-ups and finalize architecture.</w:t>
+        <w:t xml:space="preserve">Week 3: </w:t>
+      </w:r>
+      <w:r>
+        <w:rPr>
+          <w:lang w:val="en-GB"/>
+        </w:rPr>
+        <w:t>Define API surface and security model</w:t>
+      </w:r>
+      <w:r>
+        <w:rPr>
+          <w:lang w:val="en-GB"/>
+        </w:rPr>
+        <w:t>.</w:t>
       </w:r>
     </w:p>
     <w:p>
@@ -5899,14 +5959,6 @@
 </file>
 
 <file path=customXml/item1.xml><?xml version="1.0" encoding="utf-8"?>
-<p:properties xmlns:p="http://schemas.microsoft.com/office/2006/metadata/properties" xmlns:xsi="http://www.w3.org/2001/XMLSchema-instance" xmlns:pc="http://schemas.microsoft.com/office/infopath/2007/PartnerControls">
-  <documentManagement>
-    <_activity xmlns="9750baf7-fcf3-4f7a-b82f-a9f904572e35" xsi:nil="true"/>
-  </documentManagement>
-</p:properties>
-</file>
-
-<file path=customXml/item2.xml><?xml version="1.0" encoding="utf-8"?>
 <b:Sources xmlns:b="http://schemas.openxmlformats.org/officeDocument/2006/bibliography" xmlns="http://schemas.openxmlformats.org/officeDocument/2006/bibliography" SelectedStyle="\HarvardAnglia2008OfficeOnline.xsl" StyleName="Harvard - Anglia" Version="2008">
   <b:Source>
     <b:Tag>Nat</b:Tag>
@@ -5943,16 +5995,15 @@
 </b:Sources>
 </file>
 
-<file path=customXml/item3.xml><?xml version="1.0" encoding="utf-8"?>
-<?mso-contentType ?>
-<FormTemplates xmlns="http://schemas.microsoft.com/sharepoint/v3/contenttype/forms">
-  <Display>DocumentLibraryForm</Display>
-  <Edit>DocumentLibraryForm</Edit>
-  <New>DocumentLibraryForm</New>
-</FormTemplates>
+<file path=customXml/item2.xml><?xml version="1.0" encoding="utf-8"?>
+<p:properties xmlns:p="http://schemas.microsoft.com/office/2006/metadata/properties" xmlns:xsi="http://www.w3.org/2001/XMLSchema-instance" xmlns:pc="http://schemas.microsoft.com/office/infopath/2007/PartnerControls">
+  <documentManagement>
+    <_activity xmlns="9750baf7-fcf3-4f7a-b82f-a9f904572e35" xsi:nil="true"/>
+  </documentManagement>
+</p:properties>
 </file>
 
-<file path=customXml/item4.xml><?xml version="1.0" encoding="utf-8"?>
+<file path=customXml/item3.xml><?xml version="1.0" encoding="utf-8"?>
 <ct:contentTypeSchema xmlns:ct="http://schemas.microsoft.com/office/2006/metadata/contentType" xmlns:ma="http://schemas.microsoft.com/office/2006/metadata/properties/metaAttributes" ct:_="" ma:_="" ma:contentTypeName="Dokument" ma:contentTypeID="0x01010007CED4294C4A944A88CB590021F69750" ma:contentTypeVersion="6" ma:contentTypeDescription="Opret et nyt dokument." ma:contentTypeScope="" ma:versionID="21b7a254f5c57ac885d1c1f420cab55f">
   <xsd:schema xmlns:xsd="http://www.w3.org/2001/XMLSchema" xmlns:xs="http://www.w3.org/2001/XMLSchema" xmlns:p="http://schemas.microsoft.com/office/2006/metadata/properties" xmlns:ns3="9750baf7-fcf3-4f7a-b82f-a9f904572e35" targetNamespace="http://schemas.microsoft.com/office/2006/metadata/properties" ma:root="true" ma:fieldsID="f03fb0e37f38c3315d523c46f6b303d9" ns3:_="">
     <xsd:import namespace="9750baf7-fcf3-4f7a-b82f-a9f904572e35"/>
@@ -6108,7 +6159,24 @@
 </ct:contentTypeSchema>
 </file>
 
+<file path=customXml/item4.xml><?xml version="1.0" encoding="utf-8"?>
+<?mso-contentType ?>
+<FormTemplates xmlns="http://schemas.microsoft.com/sharepoint/v3/contenttype/forms">
+  <Display>DocumentLibraryForm</Display>
+  <Edit>DocumentLibraryForm</Edit>
+  <New>DocumentLibraryForm</New>
+</FormTemplates>
+</file>
+
 <file path=customXml/itemProps1.xml><?xml version="1.0" encoding="utf-8"?>
+<ds:datastoreItem xmlns:ds="http://schemas.openxmlformats.org/officeDocument/2006/customXml" ds:itemID="{EC507CA0-4407-4B6F-98F5-E05659795A92}">
+  <ds:schemaRefs>
+    <ds:schemaRef ds:uri="http://schemas.openxmlformats.org/officeDocument/2006/bibliography"/>
+  </ds:schemaRefs>
+</ds:datastoreItem>
+</file>
+
+<file path=customXml/itemProps2.xml><?xml version="1.0" encoding="utf-8"?>
 <ds:datastoreItem xmlns:ds="http://schemas.openxmlformats.org/officeDocument/2006/customXml" ds:itemID="{B3EBB357-DA60-469A-B5F2-E35DF6FD1B0D}">
   <ds:schemaRefs>
     <ds:schemaRef ds:uri="http://schemas.microsoft.com/office/2006/metadata/properties"/>
@@ -6118,23 +6186,7 @@
 </ds:datastoreItem>
 </file>
 
-<file path=customXml/itemProps2.xml><?xml version="1.0" encoding="utf-8"?>
-<ds:datastoreItem xmlns:ds="http://schemas.openxmlformats.org/officeDocument/2006/customXml" ds:itemID="{EC507CA0-4407-4B6F-98F5-E05659795A92}">
-  <ds:schemaRefs>
-    <ds:schemaRef ds:uri="http://schemas.openxmlformats.org/officeDocument/2006/bibliography"/>
-  </ds:schemaRefs>
-</ds:datastoreItem>
-</file>
-
 <file path=customXml/itemProps3.xml><?xml version="1.0" encoding="utf-8"?>
-<ds:datastoreItem xmlns:ds="http://schemas.openxmlformats.org/officeDocument/2006/customXml" ds:itemID="{36B18D59-688D-4806-A4EA-B7808C4D834E}">
-  <ds:schemaRefs>
-    <ds:schemaRef ds:uri="http://schemas.microsoft.com/sharepoint/v3/contenttype/forms"/>
-  </ds:schemaRefs>
-</ds:datastoreItem>
-</file>
-
-<file path=customXml/itemProps4.xml><?xml version="1.0" encoding="utf-8"?>
 <ds:datastoreItem xmlns:ds="http://schemas.openxmlformats.org/officeDocument/2006/customXml" ds:itemID="{348B9791-BB53-4F5C-BA95-1B32C6538009}">
   <ds:schemaRefs>
     <ds:schemaRef ds:uri="http://schemas.microsoft.com/office/2006/metadata/contentType"/>
@@ -6150,4 +6202,12 @@
     <ds:schemaRef ds:uri="http://schemas.microsoft.com/internal/obd"/>
   </ds:schemaRefs>
 </ds:datastoreItem>
+</file>
+
+<file path=customXml/itemProps4.xml><?xml version="1.0" encoding="utf-8"?>
+<ds:datastoreItem xmlns:ds="http://schemas.openxmlformats.org/officeDocument/2006/customXml" ds:itemID="{36B18D59-688D-4806-A4EA-B7808C4D834E}">
+  <ds:schemaRefs>
+    <ds:schemaRef ds:uri="http://schemas.microsoft.com/sharepoint/v3/contenttype/forms"/>
+  </ds:schemaRefs>
+</ds:datastoreItem>
 </file>
</xml_diff>